<commit_message>
Fix missing/incomplete styles: Date, AbstractTitle, Abstract, BodyText, Compact, FirstParagraph
Also add example-meta.md showing title/subtitle/author/date metadata.

Co-Authored-By: Claude Sonnet 4.6 <noreply@anthropic.com>
</commit_message>
<xml_diff>
--- a/templates/academic.docx
+++ b/templates/academic.docx
@@ -2351,11 +2351,21 @@
     <w:name w:val="Body Text"/>
     <w:basedOn w:val="Normal"/>
     <w:qFormat/>
+    <w:rPr>
+      <w:rFonts w:ascii="Cambria" w:hAnsi="Cambria" w:cs="Cambria"/>
+      <w:sz w:val="24"/>
+      <w:szCs w:val="24"/>
+    </w:rPr>
   </w:style>
   <w:style w:type="paragraph" w:styleId="FirstParagraph">
     <w:name w:val="First Paragraph"/>
     <w:basedOn w:val="Normal"/>
     <w:qFormat/>
+    <w:rPr>
+      <w:rFonts w:ascii="Cambria" w:hAnsi="Cambria" w:cs="Cambria"/>
+      <w:sz w:val="24"/>
+      <w:szCs w:val="24"/>
+    </w:rPr>
   </w:style>
   <w:style w:type="paragraph" w:styleId="Compact">
     <w:name w:val="Compact"/>
@@ -2365,6 +2375,11 @@
       <w:jc w:val="both"/>
       <w:spacing w:line="480" w:lineRule="auto" w:after="0"/>
     </w:pPr>
+    <w:rPr>
+      <w:rFonts w:ascii="Cambria" w:hAnsi="Cambria" w:cs="Cambria"/>
+      <w:sz w:val="24"/>
+      <w:szCs w:val="24"/>
+    </w:rPr>
   </w:style>
   <w:style w:type="paragraph" w:styleId="Title">
     <w:name w:val="Title"/>
@@ -2414,25 +2429,30 @@
   </w:style>
   <w:style w:type="paragraph" w:styleId="Date">
     <w:name w:val="Date"/>
-    <w:next w:val="BodyText"/>
+    <w:basedOn w:val="Normal"/>
     <w:qFormat/>
     <w:pPr>
-      <w:keepNext/>
-      <w:keepLines/>
       <w:jc w:val="center"/>
+      <w:spacing w:after="240"/>
     </w:pPr>
-  </w:style>
-  <w:style w:type="paragraph" w:customStyle="1" w:styleId="Abstract">
+    <w:rPr>
+      <w:rFonts w:ascii="Cambria" w:hAnsi="Cambria" w:cs="Cambria"/>
+      <w:i/>
+      <w:sz w:val="24"/>
+      <w:szCs w:val="24"/>
+    </w:rPr>
+  </w:style>
+  <w:style w:type="paragraph" w:styleId="Abstract">
     <w:name w:val="Abstract"/>
     <w:basedOn w:val="Normal"/>
-    <w:next w:val="BodyText"/>
     <w:qFormat/>
     <w:pPr>
-      <w:keepNext/>
-      <w:keepLines/>
-      <w:spacing w:before="300" w:after="300"/>
+      <w:jc w:val="both"/>
+      <w:ind w:left="720" w:right="720"/>
+      <w:spacing w:after="160"/>
     </w:pPr>
     <w:rPr>
+      <w:rFonts w:ascii="Cambria" w:hAnsi="Cambria" w:cs="Cambria"/>
       <w:sz w:val="20"/>
       <w:szCs w:val="20"/>
     </w:rPr>
@@ -2876,6 +2896,21 @@
     <w:basedOn w:val="DefaultParagraphFont"/>
     <w:link w:val="BodyText"/>
     <w:rsid w:val="00F9641B"/>
+  </w:style>
+  <w:style w:type="paragraph" w:styleId="AbstractTitle">
+    <w:name w:val="Abstract Title"/>
+    <w:basedOn w:val="Normal"/>
+    <w:qFormat/>
+    <w:pPr>
+      <w:jc w:val="center"/>
+      <w:spacing w:before="240" w:after="120"/>
+    </w:pPr>
+    <w:rPr>
+      <w:rFonts w:ascii="Cambria" w:hAnsi="Cambria" w:cs="Cambria"/>
+      <w:b/>
+      <w:sz w:val="24"/>
+      <w:szCs w:val="24"/>
+    </w:rPr>
   </w:style>
 </w:styles>
 </file>

</xml_diff>